<commit_message>
modify icu device word file
</commit_message>
<xml_diff>
--- a/assets/Products/ICU/Optium - MOMENTUM - ICU/MOMENTUM.docx
+++ b/assets/Products/ICU/Optium - MOMENTUM - ICU/MOMENTUM.docx
@@ -1,6 +1,6 @@
 
 <file path=word/document.xml><?xml version="1.0" encoding="utf-8"?>
-<w:document xmlns:wpc="http://schemas.microsoft.com/office/word/2010/wordprocessingCanvas" xmlns:cx="http://schemas.microsoft.com/office/drawing/2014/chartex" xmlns:cx1="http://schemas.microsoft.com/office/drawing/2015/9/8/chartex" xmlns:cx2="http://schemas.microsoft.com/office/drawing/2015/10/21/chartex" xmlns:cx3="http://schemas.microsoft.com/office/drawing/2016/5/9/chartex" xmlns:cx4="http://schemas.microsoft.com/office/drawing/2016/5/10/chartex" xmlns:cx5="http://schemas.microsoft.com/office/drawing/2016/5/11/chartex" xmlns:cx6="http://schemas.microsoft.com/office/drawing/2016/5/12/chartex" xmlns:cx7="http://schemas.microsoft.com/office/drawing/2016/5/13/chartex" xmlns:cx8="http://schemas.microsoft.com/office/drawing/2016/5/14/chartex" xmlns:mc="http://schemas.openxmlformats.org/markup-compatibility/2006" xmlns:aink="http://schemas.microsoft.com/office/drawing/2016/ink" xmlns:am3d="http://schemas.microsoft.com/office/drawing/2017/model3d" xmlns:o="urn:schemas-microsoft-com:office:office" xmlns:oel="http://schemas.microsoft.com/office/2019/extlst" xmlns:r="http://schemas.openxmlformats.org/officeDocument/2006/relationships" xmlns:m="http://schemas.openxmlformats.org/officeDocument/2006/math" xmlns:v="urn:schemas-microsoft-com:vml" xmlns:wp14="http://schemas.microsoft.com/office/word/2010/wordprocessingDrawing" xmlns:wp="http://schemas.openxmlformats.org/drawingml/2006/wordprocessingDrawing" xmlns:w10="urn:schemas-microsoft-com:office:word" xmlns:w="http://schemas.openxmlformats.org/wordprocessingml/2006/main" xmlns:w14="http://schemas.microsoft.com/office/word/2010/wordml" xmlns:w15="http://schemas.microsoft.com/office/word/2012/wordml" xmlns:w16cex="http://schemas.microsoft.com/office/word/2018/wordml/cex" xmlns:w16cid="http://schemas.microsoft.com/office/word/2016/wordml/cid" xmlns:w16="http://schemas.microsoft.com/office/word/2018/wordml" xmlns:w16du="http://schemas.microsoft.com/office/word/2023/wordml/word16du" xmlns:w16sdtdh="http://schemas.microsoft.com/office/word/2020/wordml/sdtdatahash" xmlns:w16sdtfl="http://schemas.microsoft.com/office/word/2024/wordml/sdtformatlock" xmlns:w16se="http://schemas.microsoft.com/office/word/2015/wordml/symex" xmlns:wpg="http://schemas.microsoft.com/office/word/2010/wordprocessingGroup" xmlns:wpi="http://schemas.microsoft.com/office/word/2010/wordprocessingInk" xmlns:wne="http://schemas.microsoft.com/office/word/2006/wordml" xmlns:wps="http://schemas.microsoft.com/office/word/2010/wordprocessingShape" mc:Ignorable="w14 w15 w16se w16cid w16 w16cex w16sdtdh w16sdtfl w16du wp14">
+<w:document xmlns:wpc="http://schemas.microsoft.com/office/word/2010/wordprocessingCanvas" xmlns:cx="http://schemas.microsoft.com/office/drawing/2014/chartex" xmlns:cx1="http://schemas.microsoft.com/office/drawing/2015/9/8/chartex" xmlns:cx2="http://schemas.microsoft.com/office/drawing/2015/10/21/chartex" xmlns:cx3="http://schemas.microsoft.com/office/drawing/2016/5/9/chartex" xmlns:cx4="http://schemas.microsoft.com/office/drawing/2016/5/10/chartex" xmlns:cx5="http://schemas.microsoft.com/office/drawing/2016/5/11/chartex" xmlns:cx6="http://schemas.microsoft.com/office/drawing/2016/5/12/chartex" xmlns:cx7="http://schemas.microsoft.com/office/drawing/2016/5/13/chartex" xmlns:cx8="http://schemas.microsoft.com/office/drawing/2016/5/14/chartex" xmlns:mc="http://schemas.openxmlformats.org/markup-compatibility/2006" xmlns:aink="http://schemas.microsoft.com/office/drawing/2016/ink" xmlns:am3d="http://schemas.microsoft.com/office/drawing/2017/model3d" xmlns:o="urn:schemas-microsoft-com:office:office" xmlns:r="http://schemas.openxmlformats.org/officeDocument/2006/relationships" xmlns:m="http://schemas.openxmlformats.org/officeDocument/2006/math" xmlns:v="urn:schemas-microsoft-com:vml" xmlns:wp14="http://schemas.microsoft.com/office/word/2010/wordprocessingDrawing" xmlns:wp="http://schemas.openxmlformats.org/drawingml/2006/wordprocessingDrawing" xmlns:w10="urn:schemas-microsoft-com:office:word" xmlns:w="http://schemas.openxmlformats.org/wordprocessingml/2006/main" xmlns:w14="http://schemas.microsoft.com/office/word/2010/wordml" xmlns:w15="http://schemas.microsoft.com/office/word/2012/wordml" xmlns:w16cid="http://schemas.microsoft.com/office/word/2016/wordml/cid" xmlns:w16se="http://schemas.microsoft.com/office/word/2015/wordml/symex" xmlns:wpg="http://schemas.microsoft.com/office/word/2010/wordprocessingGroup" xmlns:wpi="http://schemas.microsoft.com/office/word/2010/wordprocessingInk" xmlns:wne="http://schemas.microsoft.com/office/word/2006/wordml" xmlns:wps="http://schemas.microsoft.com/office/word/2010/wordprocessingShape" mc:Ignorable="w14 w15 w16se w16cid wp14">
   <w:body>
     <w:p>
       <w:r>
@@ -279,770 +279,137 @@
       </w:r>
     </w:p>
     <w:p>
-      <w:hyperlink r:id="rId5" w:history="1">
-        <w:r>
-          <w:rPr>
-            <w:rStyle w:val="Hyperlink"/>
-            <w:b/>
-            <w:bCs/>
-          </w:rPr>
-          <w:t>Momentum Stretcher</w:t>
-        </w:r>
-      </w:hyperlink>
       <w:r>
-        <w:t> and </w:t>
+        <w:rPr>
+          <w:b/>
+          <w:bCs/>
+        </w:rPr>
+        <w:lastRenderedPageBreak/>
+        <w:t>TECHNICAL DETAILS</w:t>
+      </w:r>
+      <w:r>
+        <w:tab/>
+      </w:r>
+    </w:p>
+    <w:p>
+      <w:r>
+        <w:tab/>
+        <w:t>Length</w:t>
+      </w:r>
+      <w:r>
+        <w:tab/>
+        <w:t>: 205 cm</w:t>
+      </w:r>
+    </w:p>
+    <w:p>
+      <w:r>
+        <w:tab/>
+        <w:t>Width</w:t>
+      </w:r>
+      <w:r>
+        <w:tab/>
+        <w:t>: 85 cm</w:t>
+      </w:r>
+    </w:p>
+    <w:p>
+      <w:r>
+        <w:tab/>
+        <w:t>Backrest Angle</w:t>
+      </w:r>
+      <w:r>
+        <w:tab/>
+        <w:t>: 0°-70°</w:t>
+      </w:r>
+    </w:p>
+    <w:p>
+      <w:r>
+        <w:tab/>
       </w:r>
       <w:proofErr w:type="spellStart"/>
       <w:r>
-        <w:fldChar w:fldCharType="begin"/>
-      </w:r>
-      <w:r>
-        <w:instrText>HYPERLINK "https://www.optium.com.tr/product/emergeum/"</w:instrText>
-      </w:r>
-      <w:r>
-        <w:fldChar w:fldCharType="separate"/>
-      </w:r>
-      <w:r>
-        <w:rPr>
-          <w:rStyle w:val="Hyperlink"/>
-          <w:b/>
-          <w:bCs/>
-        </w:rPr>
-        <w:t>Emergeum</w:t>
+        <w:t>Legrest</w:t>
       </w:r>
       <w:proofErr w:type="spellEnd"/>
       <w:r>
-        <w:rPr>
-          <w:rStyle w:val="Hyperlink"/>
-          <w:b/>
-          <w:bCs/>
-        </w:rPr>
-        <w:t xml:space="preserve"> Emergency Stretcher</w:t>
+        <w:t xml:space="preserve"> Angle</w:t>
       </w:r>
       <w:r>
-        <w:fldChar w:fldCharType="end"/>
+        <w:tab/>
+        <w:t>: 0°-40°</w:t>
       </w:r>
     </w:p>
-    <w:tbl>
-      <w:tblPr>
-        <w:tblW w:w="5000" w:type="pct"/>
-        <w:tblCellMar>
-          <w:top w:w="15" w:type="dxa"/>
-          <w:left w:w="15" w:type="dxa"/>
-          <w:bottom w:w="15" w:type="dxa"/>
-          <w:right w:w="15" w:type="dxa"/>
-        </w:tblCellMar>
-        <w:tblLook w:val="04A0" w:firstRow="1" w:lastRow="0" w:firstColumn="1" w:lastColumn="0" w:noHBand="0" w:noVBand="1"/>
-      </w:tblPr>
-      <w:tblGrid>
-        <w:gridCol w:w="94"/>
-        <w:gridCol w:w="4586"/>
-        <w:gridCol w:w="4680"/>
-      </w:tblGrid>
-      <w:tr>
-        <w:trPr>
-          <w:trHeight w:val="600"/>
-          <w:tblHeader/>
-        </w:trPr>
-        <w:tc>
-          <w:tcPr>
-            <w:tcW w:w="50" w:type="pct"/>
-            <w:shd w:val="clear" w:color="auto" w:fill="F6F6F6"/>
-            <w:vAlign w:val="center"/>
-            <w:hideMark/>
-          </w:tcPr>
-          <w:p/>
-        </w:tc>
-        <w:tc>
-          <w:tcPr>
-            <w:tcW w:w="2450" w:type="pct"/>
-            <w:shd w:val="clear" w:color="auto" w:fill="F6F6F6"/>
-            <w:vAlign w:val="center"/>
-            <w:hideMark/>
-          </w:tcPr>
-          <w:p>
-            <w:r>
-              <w:rPr>
-                <w:b/>
-                <w:bCs/>
-              </w:rPr>
-              <w:t>TECHNICAL DETAILS</w:t>
-            </w:r>
-          </w:p>
-        </w:tc>
-        <w:tc>
-          <w:tcPr>
-            <w:tcW w:w="2500" w:type="pct"/>
-            <w:shd w:val="clear" w:color="auto" w:fill="F6F6F6"/>
-            <w:vAlign w:val="center"/>
-            <w:hideMark/>
-          </w:tcPr>
-          <w:p/>
-        </w:tc>
-      </w:tr>
-      <w:tr>
-        <w:tc>
-          <w:tcPr>
-            <w:tcW w:w="50" w:type="pct"/>
-            <w:tcBorders>
-              <w:top w:val="nil"/>
-              <w:left w:val="nil"/>
-              <w:bottom w:val="nil"/>
-              <w:right w:val="nil"/>
-            </w:tcBorders>
-            <w:vAlign w:val="center"/>
-            <w:hideMark/>
-          </w:tcPr>
-          <w:p/>
-        </w:tc>
-        <w:tc>
-          <w:tcPr>
-            <w:tcW w:w="2450" w:type="pct"/>
-            <w:tcBorders>
-              <w:top w:val="nil"/>
-              <w:left w:val="nil"/>
-              <w:bottom w:val="nil"/>
-              <w:right w:val="nil"/>
-            </w:tcBorders>
-            <w:vAlign w:val="center"/>
-            <w:hideMark/>
-          </w:tcPr>
-          <w:p>
-            <w:r>
-              <w:t>Length</w:t>
-            </w:r>
-          </w:p>
-        </w:tc>
-        <w:tc>
-          <w:tcPr>
-            <w:tcW w:w="2500" w:type="pct"/>
-            <w:tcBorders>
-              <w:top w:val="nil"/>
-              <w:left w:val="nil"/>
-              <w:bottom w:val="nil"/>
-              <w:right w:val="nil"/>
-            </w:tcBorders>
-            <w:vAlign w:val="center"/>
-            <w:hideMark/>
-          </w:tcPr>
-          <w:p>
-            <w:r>
-              <w:t>: 205 cm</w:t>
-            </w:r>
-          </w:p>
-        </w:tc>
-      </w:tr>
-      <w:tr>
-        <w:tc>
-          <w:tcPr>
-            <w:tcW w:w="50" w:type="pct"/>
-            <w:tcBorders>
-              <w:top w:val="nil"/>
-              <w:left w:val="nil"/>
-              <w:bottom w:val="nil"/>
-              <w:right w:val="nil"/>
-            </w:tcBorders>
-            <w:shd w:val="clear" w:color="auto" w:fill="F6F6F6"/>
-            <w:vAlign w:val="center"/>
-            <w:hideMark/>
-          </w:tcPr>
-          <w:p/>
-        </w:tc>
-        <w:tc>
-          <w:tcPr>
-            <w:tcW w:w="2450" w:type="pct"/>
-            <w:tcBorders>
-              <w:top w:val="nil"/>
-              <w:left w:val="nil"/>
-              <w:bottom w:val="nil"/>
-              <w:right w:val="nil"/>
-            </w:tcBorders>
-            <w:shd w:val="clear" w:color="auto" w:fill="F6F6F6"/>
-            <w:vAlign w:val="center"/>
-            <w:hideMark/>
-          </w:tcPr>
-          <w:p>
-            <w:r>
-              <w:t>Width</w:t>
-            </w:r>
-          </w:p>
-        </w:tc>
-        <w:tc>
-          <w:tcPr>
-            <w:tcW w:w="2500" w:type="pct"/>
-            <w:tcBorders>
-              <w:top w:val="nil"/>
-              <w:left w:val="nil"/>
-              <w:bottom w:val="nil"/>
-              <w:right w:val="nil"/>
-            </w:tcBorders>
-            <w:shd w:val="clear" w:color="auto" w:fill="F6F6F6"/>
-            <w:vAlign w:val="center"/>
-            <w:hideMark/>
-          </w:tcPr>
-          <w:p>
-            <w:r>
-              <w:t>: 85 cm</w:t>
-            </w:r>
-          </w:p>
-        </w:tc>
-      </w:tr>
-      <w:tr>
-        <w:tc>
-          <w:tcPr>
-            <w:tcW w:w="50" w:type="pct"/>
-            <w:tcBorders>
-              <w:top w:val="nil"/>
-              <w:left w:val="nil"/>
-              <w:bottom w:val="nil"/>
-              <w:right w:val="nil"/>
-            </w:tcBorders>
-            <w:vAlign w:val="center"/>
-            <w:hideMark/>
-          </w:tcPr>
-          <w:p/>
-        </w:tc>
-        <w:tc>
-          <w:tcPr>
-            <w:tcW w:w="2450" w:type="pct"/>
-            <w:tcBorders>
-              <w:top w:val="nil"/>
-              <w:left w:val="nil"/>
-              <w:bottom w:val="nil"/>
-              <w:right w:val="nil"/>
-            </w:tcBorders>
-            <w:vAlign w:val="center"/>
-            <w:hideMark/>
-          </w:tcPr>
-          <w:p>
-            <w:r>
-              <w:t>Backrest Angle</w:t>
-            </w:r>
-          </w:p>
-        </w:tc>
-        <w:tc>
-          <w:tcPr>
-            <w:tcW w:w="2500" w:type="pct"/>
-            <w:tcBorders>
-              <w:top w:val="nil"/>
-              <w:left w:val="nil"/>
-              <w:bottom w:val="nil"/>
-              <w:right w:val="nil"/>
-            </w:tcBorders>
-            <w:vAlign w:val="center"/>
-            <w:hideMark/>
-          </w:tcPr>
-          <w:p>
-            <w:r>
-              <w:t>: 0°-70°</w:t>
-            </w:r>
-          </w:p>
-        </w:tc>
-      </w:tr>
-      <w:tr>
-        <w:tc>
-          <w:tcPr>
-            <w:tcW w:w="50" w:type="pct"/>
-            <w:tcBorders>
-              <w:top w:val="nil"/>
-              <w:left w:val="nil"/>
-              <w:bottom w:val="nil"/>
-              <w:right w:val="nil"/>
-            </w:tcBorders>
-            <w:shd w:val="clear" w:color="auto" w:fill="F6F6F6"/>
-            <w:vAlign w:val="center"/>
-            <w:hideMark/>
-          </w:tcPr>
-          <w:p/>
-        </w:tc>
-        <w:tc>
-          <w:tcPr>
-            <w:tcW w:w="2450" w:type="pct"/>
-            <w:tcBorders>
-              <w:top w:val="nil"/>
-              <w:left w:val="nil"/>
-              <w:bottom w:val="nil"/>
-              <w:right w:val="nil"/>
-            </w:tcBorders>
-            <w:shd w:val="clear" w:color="auto" w:fill="F6F6F6"/>
-            <w:vAlign w:val="center"/>
-            <w:hideMark/>
-          </w:tcPr>
-          <w:p>
-            <w:proofErr w:type="spellStart"/>
-            <w:r>
-              <w:t>Legrest</w:t>
-            </w:r>
-            <w:proofErr w:type="spellEnd"/>
-            <w:r>
-              <w:t xml:space="preserve"> Angle</w:t>
-            </w:r>
-          </w:p>
-        </w:tc>
-        <w:tc>
-          <w:tcPr>
-            <w:tcW w:w="2500" w:type="pct"/>
-            <w:tcBorders>
-              <w:top w:val="nil"/>
-              <w:left w:val="nil"/>
-              <w:bottom w:val="nil"/>
-              <w:right w:val="nil"/>
-            </w:tcBorders>
-            <w:shd w:val="clear" w:color="auto" w:fill="F6F6F6"/>
-            <w:vAlign w:val="center"/>
-            <w:hideMark/>
-          </w:tcPr>
-          <w:p>
-            <w:r>
-              <w:t>: 0°-40°</w:t>
-            </w:r>
-          </w:p>
-        </w:tc>
-      </w:tr>
-      <w:tr>
-        <w:tc>
-          <w:tcPr>
-            <w:tcW w:w="50" w:type="pct"/>
-            <w:tcBorders>
-              <w:top w:val="nil"/>
-              <w:left w:val="nil"/>
-              <w:bottom w:val="nil"/>
-              <w:right w:val="nil"/>
-            </w:tcBorders>
-            <w:vAlign w:val="center"/>
-            <w:hideMark/>
-          </w:tcPr>
-          <w:p/>
-        </w:tc>
-        <w:tc>
-          <w:tcPr>
-            <w:tcW w:w="2450" w:type="pct"/>
-            <w:tcBorders>
-              <w:top w:val="nil"/>
-              <w:left w:val="nil"/>
-              <w:bottom w:val="nil"/>
-              <w:right w:val="nil"/>
-            </w:tcBorders>
-            <w:vAlign w:val="center"/>
-            <w:hideMark/>
-          </w:tcPr>
-          <w:p>
-            <w:r>
-              <w:t>TR/RTR Angle</w:t>
-            </w:r>
-          </w:p>
-        </w:tc>
-        <w:tc>
-          <w:tcPr>
-            <w:tcW w:w="2500" w:type="pct"/>
-            <w:tcBorders>
-              <w:top w:val="nil"/>
-              <w:left w:val="nil"/>
-              <w:bottom w:val="nil"/>
-              <w:right w:val="nil"/>
-            </w:tcBorders>
-            <w:vAlign w:val="center"/>
-            <w:hideMark/>
-          </w:tcPr>
-          <w:p>
-            <w:r>
-              <w:t>: 0°-16°</w:t>
-            </w:r>
-          </w:p>
-        </w:tc>
-      </w:tr>
-      <w:tr>
-        <w:tc>
-          <w:tcPr>
-            <w:tcW w:w="50" w:type="pct"/>
-            <w:tcBorders>
-              <w:top w:val="nil"/>
-              <w:left w:val="nil"/>
-              <w:bottom w:val="nil"/>
-              <w:right w:val="nil"/>
-            </w:tcBorders>
-            <w:shd w:val="clear" w:color="auto" w:fill="F6F6F6"/>
-            <w:vAlign w:val="center"/>
-            <w:hideMark/>
-          </w:tcPr>
-          <w:p/>
-        </w:tc>
-        <w:tc>
-          <w:tcPr>
-            <w:tcW w:w="2450" w:type="pct"/>
-            <w:tcBorders>
-              <w:top w:val="nil"/>
-              <w:left w:val="nil"/>
-              <w:bottom w:val="nil"/>
-              <w:right w:val="nil"/>
-            </w:tcBorders>
-            <w:shd w:val="clear" w:color="auto" w:fill="F6F6F6"/>
-            <w:vAlign w:val="center"/>
-            <w:hideMark/>
-          </w:tcPr>
-          <w:p>
-            <w:r>
-              <w:t>Height (</w:t>
-            </w:r>
-            <w:r>
-              <w:rPr>
-                <w:i/>
-                <w:iCs/>
-              </w:rPr>
-              <w:t>Without Mattress</w:t>
-            </w:r>
-            <w:r>
-              <w:t>)</w:t>
-            </w:r>
-          </w:p>
-        </w:tc>
-        <w:tc>
-          <w:tcPr>
-            <w:tcW w:w="2500" w:type="pct"/>
-            <w:tcBorders>
-              <w:top w:val="nil"/>
-              <w:left w:val="nil"/>
-              <w:bottom w:val="nil"/>
-              <w:right w:val="nil"/>
-            </w:tcBorders>
-            <w:shd w:val="clear" w:color="auto" w:fill="F6F6F6"/>
-            <w:vAlign w:val="center"/>
-            <w:hideMark/>
-          </w:tcPr>
-          <w:p>
-            <w:r>
-              <w:t>: 65-95 cm</w:t>
-            </w:r>
-          </w:p>
-        </w:tc>
-      </w:tr>
-      <w:tr>
-        <w:tc>
-          <w:tcPr>
-            <w:tcW w:w="50" w:type="pct"/>
-            <w:tcBorders>
-              <w:top w:val="nil"/>
-              <w:left w:val="nil"/>
-              <w:bottom w:val="nil"/>
-              <w:right w:val="nil"/>
-            </w:tcBorders>
-            <w:vAlign w:val="center"/>
-            <w:hideMark/>
-          </w:tcPr>
-          <w:p/>
-        </w:tc>
-        <w:tc>
-          <w:tcPr>
-            <w:tcW w:w="2450" w:type="pct"/>
-            <w:tcBorders>
-              <w:top w:val="nil"/>
-              <w:left w:val="nil"/>
-              <w:bottom w:val="nil"/>
-              <w:right w:val="nil"/>
-            </w:tcBorders>
-            <w:vAlign w:val="center"/>
-            <w:hideMark/>
-          </w:tcPr>
-          <w:p>
-            <w:r>
-              <w:t>Castor Diameter</w:t>
-            </w:r>
-          </w:p>
-        </w:tc>
-        <w:tc>
-          <w:tcPr>
-            <w:tcW w:w="2500" w:type="pct"/>
-            <w:tcBorders>
-              <w:top w:val="nil"/>
-              <w:left w:val="nil"/>
-              <w:bottom w:val="nil"/>
-              <w:right w:val="nil"/>
-            </w:tcBorders>
-            <w:vAlign w:val="center"/>
-            <w:hideMark/>
-          </w:tcPr>
-          <w:p>
-            <w:r>
-              <w:t>: 200 mm</w:t>
-            </w:r>
-          </w:p>
-        </w:tc>
-      </w:tr>
-      <w:tr>
-        <w:tc>
-          <w:tcPr>
-            <w:tcW w:w="50" w:type="pct"/>
-            <w:tcBorders>
-              <w:top w:val="nil"/>
-              <w:left w:val="nil"/>
-              <w:bottom w:val="nil"/>
-              <w:right w:val="nil"/>
-            </w:tcBorders>
-            <w:shd w:val="clear" w:color="auto" w:fill="F6F6F6"/>
-            <w:vAlign w:val="center"/>
-            <w:hideMark/>
-          </w:tcPr>
-          <w:p/>
-        </w:tc>
-        <w:tc>
-          <w:tcPr>
-            <w:tcW w:w="2450" w:type="pct"/>
-            <w:tcBorders>
-              <w:top w:val="nil"/>
-              <w:left w:val="nil"/>
-              <w:bottom w:val="nil"/>
-              <w:right w:val="nil"/>
-            </w:tcBorders>
-            <w:shd w:val="clear" w:color="auto" w:fill="F6F6F6"/>
-            <w:vAlign w:val="center"/>
-            <w:hideMark/>
-          </w:tcPr>
-          <w:p>
-            <w:r>
-              <w:t>5th Castor Diameter </w:t>
-            </w:r>
-            <w:r>
-              <w:rPr>
-                <w:i/>
-                <w:iCs/>
-              </w:rPr>
-              <w:t>(optional)</w:t>
-            </w:r>
-          </w:p>
-        </w:tc>
-        <w:tc>
-          <w:tcPr>
-            <w:tcW w:w="2500" w:type="pct"/>
-            <w:tcBorders>
-              <w:top w:val="nil"/>
-              <w:left w:val="nil"/>
-              <w:bottom w:val="nil"/>
-              <w:right w:val="nil"/>
-            </w:tcBorders>
-            <w:shd w:val="clear" w:color="auto" w:fill="F6F6F6"/>
-            <w:vAlign w:val="center"/>
-            <w:hideMark/>
-          </w:tcPr>
-          <w:p>
-            <w:r>
-              <w:t>: 125 mm</w:t>
-            </w:r>
-          </w:p>
-        </w:tc>
-      </w:tr>
-      <w:tr>
-        <w:tc>
-          <w:tcPr>
-            <w:tcW w:w="50" w:type="pct"/>
-            <w:tcBorders>
-              <w:top w:val="nil"/>
-              <w:left w:val="nil"/>
-              <w:bottom w:val="nil"/>
-              <w:right w:val="nil"/>
-            </w:tcBorders>
-            <w:vAlign w:val="center"/>
-            <w:hideMark/>
-          </w:tcPr>
-          <w:p/>
-        </w:tc>
-        <w:tc>
-          <w:tcPr>
-            <w:tcW w:w="2450" w:type="pct"/>
-            <w:tcBorders>
-              <w:top w:val="nil"/>
-              <w:left w:val="nil"/>
-              <w:bottom w:val="nil"/>
-              <w:right w:val="nil"/>
-            </w:tcBorders>
-            <w:vAlign w:val="center"/>
-            <w:hideMark/>
-          </w:tcPr>
-          <w:p>
-            <w:r>
-              <w:t>Mattress Surface</w:t>
-            </w:r>
-          </w:p>
-        </w:tc>
-        <w:tc>
-          <w:tcPr>
-            <w:tcW w:w="2500" w:type="pct"/>
-            <w:tcBorders>
-              <w:top w:val="nil"/>
-              <w:left w:val="nil"/>
-              <w:bottom w:val="nil"/>
-              <w:right w:val="nil"/>
-            </w:tcBorders>
-            <w:vAlign w:val="center"/>
-            <w:hideMark/>
-          </w:tcPr>
-          <w:p>
-            <w:r>
-              <w:t>: 62,5 x 190 cm</w:t>
-            </w:r>
-          </w:p>
-        </w:tc>
-      </w:tr>
-      <w:tr>
-        <w:tc>
-          <w:tcPr>
-            <w:tcW w:w="50" w:type="pct"/>
-            <w:tcBorders>
-              <w:top w:val="nil"/>
-              <w:left w:val="nil"/>
-              <w:bottom w:val="nil"/>
-              <w:right w:val="nil"/>
-            </w:tcBorders>
-            <w:shd w:val="clear" w:color="auto" w:fill="F6F6F6"/>
-            <w:vAlign w:val="center"/>
-            <w:hideMark/>
-          </w:tcPr>
-          <w:p/>
-        </w:tc>
-        <w:tc>
-          <w:tcPr>
-            <w:tcW w:w="2450" w:type="pct"/>
-            <w:tcBorders>
-              <w:top w:val="nil"/>
-              <w:left w:val="nil"/>
-              <w:bottom w:val="nil"/>
-              <w:right w:val="nil"/>
-            </w:tcBorders>
-            <w:shd w:val="clear" w:color="auto" w:fill="F6F6F6"/>
-            <w:vAlign w:val="center"/>
-            <w:hideMark/>
-          </w:tcPr>
-          <w:p>
-            <w:r>
-              <w:t>Mattress Thickness</w:t>
-            </w:r>
-          </w:p>
-        </w:tc>
-        <w:tc>
-          <w:tcPr>
-            <w:tcW w:w="2500" w:type="pct"/>
-            <w:tcBorders>
-              <w:top w:val="nil"/>
-              <w:left w:val="nil"/>
-              <w:bottom w:val="nil"/>
-              <w:right w:val="nil"/>
-            </w:tcBorders>
-            <w:shd w:val="clear" w:color="auto" w:fill="F6F6F6"/>
-            <w:vAlign w:val="center"/>
-            <w:hideMark/>
-          </w:tcPr>
-          <w:p>
-            <w:r>
-              <w:t>: 8 cm</w:t>
-            </w:r>
-          </w:p>
-        </w:tc>
-      </w:tr>
-      <w:tr>
-        <w:tc>
-          <w:tcPr>
-            <w:tcW w:w="50" w:type="pct"/>
-            <w:tcBorders>
-              <w:top w:val="nil"/>
-              <w:left w:val="nil"/>
-              <w:bottom w:val="nil"/>
-              <w:right w:val="nil"/>
-            </w:tcBorders>
-            <w:vAlign w:val="center"/>
-            <w:hideMark/>
-          </w:tcPr>
-          <w:p/>
-        </w:tc>
-        <w:tc>
-          <w:tcPr>
-            <w:tcW w:w="2450" w:type="pct"/>
-            <w:tcBorders>
-              <w:top w:val="nil"/>
-              <w:left w:val="nil"/>
-              <w:bottom w:val="nil"/>
-              <w:right w:val="nil"/>
-            </w:tcBorders>
-            <w:vAlign w:val="center"/>
-            <w:hideMark/>
-          </w:tcPr>
-          <w:p>
-            <w:r>
-              <w:t>Safe Working Load</w:t>
-            </w:r>
-          </w:p>
-        </w:tc>
-        <w:tc>
-          <w:tcPr>
-            <w:tcW w:w="2500" w:type="pct"/>
-            <w:tcBorders>
-              <w:top w:val="nil"/>
-              <w:left w:val="nil"/>
-              <w:bottom w:val="nil"/>
-              <w:right w:val="nil"/>
-            </w:tcBorders>
-            <w:vAlign w:val="center"/>
-            <w:hideMark/>
-          </w:tcPr>
-          <w:p>
-            <w:r>
-              <w:t>: 250 kg</w:t>
-            </w:r>
-          </w:p>
-        </w:tc>
-      </w:tr>
-    </w:tbl>
     <w:p>
       <w:r>
-        <w:drawing>
-          <wp:inline distT="0" distB="0" distL="0" distR="0" wp14:anchorId="31A7BF62" wp14:editId="0E157A0C">
-            <wp:extent cx="5943600" cy="1307465"/>
-            <wp:effectExtent l="0" t="0" r="0" b="6985"/>
-            <wp:docPr id="1854487258" name="Picture 2" descr="A close up of a logo&#10;&#10;AI-generated content may be incorrect."/>
-            <wp:cNvGraphicFramePr>
-              <a:graphicFrameLocks xmlns:a="http://schemas.openxmlformats.org/drawingml/2006/main" noChangeAspect="1"/>
-            </wp:cNvGraphicFramePr>
-            <a:graphic xmlns:a="http://schemas.openxmlformats.org/drawingml/2006/main">
-              <a:graphicData uri="http://schemas.openxmlformats.org/drawingml/2006/picture">
-                <pic:pic xmlns:pic="http://schemas.openxmlformats.org/drawingml/2006/picture">
-                  <pic:nvPicPr>
-                    <pic:cNvPr id="1854487258" name="Picture 2" descr="A close up of a logo&#10;&#10;AI-generated content may be incorrect."/>
-                    <pic:cNvPicPr>
-                      <a:picLocks noChangeAspect="1" noChangeArrowheads="1"/>
-                    </pic:cNvPicPr>
-                  </pic:nvPicPr>
-                  <pic:blipFill>
-                    <a:blip r:embed="rId6">
-                      <a:extLst>
-                        <a:ext uri="{28A0092B-C50C-407E-A947-70E740481C1C}">
-                          <a14:useLocalDpi xmlns:a14="http://schemas.microsoft.com/office/drawing/2010/main" val="0"/>
-                        </a:ext>
-                      </a:extLst>
-                    </a:blip>
-                    <a:srcRect/>
-                    <a:stretch>
-                      <a:fillRect/>
-                    </a:stretch>
-                  </pic:blipFill>
-                  <pic:spPr bwMode="auto">
-                    <a:xfrm>
-                      <a:off x="0" y="0"/>
-                      <a:ext cx="5943600" cy="1307465"/>
-                    </a:xfrm>
-                    <a:prstGeom prst="rect">
-                      <a:avLst/>
-                    </a:prstGeom>
-                    <a:noFill/>
-                    <a:ln>
-                      <a:noFill/>
-                    </a:ln>
-                  </pic:spPr>
-                </pic:pic>
-              </a:graphicData>
-            </a:graphic>
-          </wp:inline>
-        </w:drawing>
+        <w:tab/>
+        <w:t>TR/RTR Angle</w:t>
+      </w:r>
+      <w:r>
+        <w:tab/>
+        <w:t>: 0°-16°</w:t>
       </w:r>
     </w:p>
-    <w:p/>
+    <w:p>
+      <w:r>
+        <w:tab/>
+        <w:t>Height (Without Mattress)</w:t>
+      </w:r>
+      <w:r>
+        <w:tab/>
+        <w:t>: 65-95 cm</w:t>
+      </w:r>
+    </w:p>
+    <w:p>
+      <w:r>
+        <w:tab/>
+        <w:t>Castor Diameter</w:t>
+      </w:r>
+      <w:r>
+        <w:tab/>
+        <w:t>: 200 mm</w:t>
+      </w:r>
+    </w:p>
+    <w:p>
+      <w:r>
+        <w:tab/>
+        <w:t>5th Castor Diameter (optional)</w:t>
+      </w:r>
+      <w:r>
+        <w:tab/>
+        <w:t>: 125 mm</w:t>
+      </w:r>
+    </w:p>
+    <w:p>
+      <w:r>
+        <w:tab/>
+        <w:t>Mattress Surface</w:t>
+      </w:r>
+      <w:r>
+        <w:tab/>
+        <w:t>: 62,5 x 190 cm</w:t>
+      </w:r>
+    </w:p>
+    <w:p>
+      <w:r>
+        <w:tab/>
+        <w:t>Mattress Thickness</w:t>
+      </w:r>
+      <w:r>
+        <w:tab/>
+        <w:t>: 8 cm</w:t>
+      </w:r>
+    </w:p>
+    <w:p>
+      <w:r>
+        <w:tab/>
+        <w:t>Safe Working Load</w:t>
+      </w:r>
+      <w:r>
+        <w:tab/>
+        <w:t>: 250 kg</w:t>
+      </w:r>
+      <w:bookmarkStart w:id="0" w:name="_GoBack"/>
+      <w:bookmarkEnd w:id="0"/>
+    </w:p>
     <w:sectPr>
       <w:pgSz w:w="12240" w:h="15840"/>
       <w:pgMar w:top="1440" w:right="1440" w:bottom="1440" w:left="1440" w:header="720" w:footer="720" w:gutter="0"/>
@@ -1054,7 +421,7 @@
 </file>
 
 <file path=word/numbering.xml><?xml version="1.0" encoding="utf-8"?>
-<w:numbering xmlns:wpc="http://schemas.microsoft.com/office/word/2010/wordprocessingCanvas" xmlns:cx="http://schemas.microsoft.com/office/drawing/2014/chartex" xmlns:cx1="http://schemas.microsoft.com/office/drawing/2015/9/8/chartex" xmlns:cx2="http://schemas.microsoft.com/office/drawing/2015/10/21/chartex" xmlns:cx3="http://schemas.microsoft.com/office/drawing/2016/5/9/chartex" xmlns:cx4="http://schemas.microsoft.com/office/drawing/2016/5/10/chartex" xmlns:cx5="http://schemas.microsoft.com/office/drawing/2016/5/11/chartex" xmlns:cx6="http://schemas.microsoft.com/office/drawing/2016/5/12/chartex" xmlns:cx7="http://schemas.microsoft.com/office/drawing/2016/5/13/chartex" xmlns:cx8="http://schemas.microsoft.com/office/drawing/2016/5/14/chartex" xmlns:mc="http://schemas.openxmlformats.org/markup-compatibility/2006" xmlns:aink="http://schemas.microsoft.com/office/drawing/2016/ink" xmlns:am3d="http://schemas.microsoft.com/office/drawing/2017/model3d" xmlns:o="urn:schemas-microsoft-com:office:office" xmlns:oel="http://schemas.microsoft.com/office/2019/extlst" xmlns:r="http://schemas.openxmlformats.org/officeDocument/2006/relationships" xmlns:m="http://schemas.openxmlformats.org/officeDocument/2006/math" xmlns:v="urn:schemas-microsoft-com:vml" xmlns:wp14="http://schemas.microsoft.com/office/word/2010/wordprocessingDrawing" xmlns:wp="http://schemas.openxmlformats.org/drawingml/2006/wordprocessingDrawing" xmlns:w10="urn:schemas-microsoft-com:office:word" xmlns:w="http://schemas.openxmlformats.org/wordprocessingml/2006/main" xmlns:w14="http://schemas.microsoft.com/office/word/2010/wordml" xmlns:w15="http://schemas.microsoft.com/office/word/2012/wordml" xmlns:w16cex="http://schemas.microsoft.com/office/word/2018/wordml/cex" xmlns:w16cid="http://schemas.microsoft.com/office/word/2016/wordml/cid" xmlns:w16="http://schemas.microsoft.com/office/word/2018/wordml" xmlns:w16du="http://schemas.microsoft.com/office/word/2023/wordml/word16du" xmlns:w16sdtdh="http://schemas.microsoft.com/office/word/2020/wordml/sdtdatahash" xmlns:w16sdtfl="http://schemas.microsoft.com/office/word/2024/wordml/sdtformatlock" xmlns:w16se="http://schemas.microsoft.com/office/word/2015/wordml/symex" xmlns:wpg="http://schemas.microsoft.com/office/word/2010/wordprocessingGroup" xmlns:wpi="http://schemas.microsoft.com/office/word/2010/wordprocessingInk" xmlns:wne="http://schemas.microsoft.com/office/word/2006/wordml" xmlns:wps="http://schemas.microsoft.com/office/word/2010/wordprocessingShape" mc:Ignorable="w14 w15 w16se w16cid w16 w16cex w16sdtdh w16sdtfl w16du wp14">
+<w:numbering xmlns:wpc="http://schemas.microsoft.com/office/word/2010/wordprocessingCanvas" xmlns:cx="http://schemas.microsoft.com/office/drawing/2014/chartex" xmlns:cx1="http://schemas.microsoft.com/office/drawing/2015/9/8/chartex" xmlns:cx2="http://schemas.microsoft.com/office/drawing/2015/10/21/chartex" xmlns:cx3="http://schemas.microsoft.com/office/drawing/2016/5/9/chartex" xmlns:cx4="http://schemas.microsoft.com/office/drawing/2016/5/10/chartex" xmlns:cx5="http://schemas.microsoft.com/office/drawing/2016/5/11/chartex" xmlns:cx6="http://schemas.microsoft.com/office/drawing/2016/5/12/chartex" xmlns:cx7="http://schemas.microsoft.com/office/drawing/2016/5/13/chartex" xmlns:cx8="http://schemas.microsoft.com/office/drawing/2016/5/14/chartex" xmlns:mc="http://schemas.openxmlformats.org/markup-compatibility/2006" xmlns:aink="http://schemas.microsoft.com/office/drawing/2016/ink" xmlns:am3d="http://schemas.microsoft.com/office/drawing/2017/model3d" xmlns:o="urn:schemas-microsoft-com:office:office" xmlns:r="http://schemas.openxmlformats.org/officeDocument/2006/relationships" xmlns:m="http://schemas.openxmlformats.org/officeDocument/2006/math" xmlns:v="urn:schemas-microsoft-com:vml" xmlns:wp14="http://schemas.microsoft.com/office/word/2010/wordprocessingDrawing" xmlns:wp="http://schemas.openxmlformats.org/drawingml/2006/wordprocessingDrawing" xmlns:w10="urn:schemas-microsoft-com:office:word" xmlns:w="http://schemas.openxmlformats.org/wordprocessingml/2006/main" xmlns:w14="http://schemas.microsoft.com/office/word/2010/wordml" xmlns:w15="http://schemas.microsoft.com/office/word/2012/wordml" xmlns:w16cid="http://schemas.microsoft.com/office/word/2016/wordml/cid" xmlns:w16se="http://schemas.microsoft.com/office/word/2015/wordml/symex" xmlns:wpg="http://schemas.microsoft.com/office/word/2010/wordprocessingGroup" xmlns:wpi="http://schemas.microsoft.com/office/word/2010/wordprocessingInk" xmlns:wne="http://schemas.microsoft.com/office/word/2006/wordml" xmlns:wps="http://schemas.microsoft.com/office/word/2010/wordprocessingShape" mc:Ignorable="w14 w15 w16se w16cid wp14">
   <w:abstractNum w:abstractNumId="0" w15:restartNumberingAfterBreak="0">
     <w:nsid w:val="07FD2CA1"/>
     <w:multiLevelType w:val="multilevel"/>
@@ -4780,86 +4147,86 @@
       </w:rPr>
     </w:lvl>
   </w:abstractNum>
-  <w:num w:numId="1" w16cid:durableId="1115369000">
+  <w:num w:numId="1">
     <w:abstractNumId w:val="7"/>
   </w:num>
-  <w:num w:numId="2" w16cid:durableId="980109635">
+  <w:num w:numId="2">
     <w:abstractNumId w:val="13"/>
   </w:num>
-  <w:num w:numId="3" w16cid:durableId="1387294498">
+  <w:num w:numId="3">
     <w:abstractNumId w:val="4"/>
   </w:num>
-  <w:num w:numId="4" w16cid:durableId="1068958809">
+  <w:num w:numId="4">
     <w:abstractNumId w:val="18"/>
   </w:num>
-  <w:num w:numId="5" w16cid:durableId="1935236192">
+  <w:num w:numId="5">
     <w:abstractNumId w:val="2"/>
   </w:num>
-  <w:num w:numId="6" w16cid:durableId="1782534333">
+  <w:num w:numId="6">
     <w:abstractNumId w:val="3"/>
   </w:num>
-  <w:num w:numId="7" w16cid:durableId="631787452">
+  <w:num w:numId="7">
     <w:abstractNumId w:val="14"/>
   </w:num>
-  <w:num w:numId="8" w16cid:durableId="77335620">
+  <w:num w:numId="8">
     <w:abstractNumId w:val="10"/>
   </w:num>
-  <w:num w:numId="9" w16cid:durableId="203249411">
+  <w:num w:numId="9">
     <w:abstractNumId w:val="8"/>
   </w:num>
-  <w:num w:numId="10" w16cid:durableId="952595340">
+  <w:num w:numId="10">
     <w:abstractNumId w:val="9"/>
   </w:num>
-  <w:num w:numId="11" w16cid:durableId="1278948022">
+  <w:num w:numId="11">
     <w:abstractNumId w:val="23"/>
   </w:num>
-  <w:num w:numId="12" w16cid:durableId="831339028">
+  <w:num w:numId="12">
     <w:abstractNumId w:val="6"/>
   </w:num>
-  <w:num w:numId="13" w16cid:durableId="398020613">
+  <w:num w:numId="13">
     <w:abstractNumId w:val="21"/>
   </w:num>
-  <w:num w:numId="14" w16cid:durableId="1488669905">
+  <w:num w:numId="14">
     <w:abstractNumId w:val="16"/>
   </w:num>
-  <w:num w:numId="15" w16cid:durableId="484247711">
+  <w:num w:numId="15">
     <w:abstractNumId w:val="20"/>
   </w:num>
-  <w:num w:numId="16" w16cid:durableId="961689951">
+  <w:num w:numId="16">
     <w:abstractNumId w:val="22"/>
   </w:num>
-  <w:num w:numId="17" w16cid:durableId="1384909699">
+  <w:num w:numId="17">
     <w:abstractNumId w:val="12"/>
   </w:num>
-  <w:num w:numId="18" w16cid:durableId="1086614027">
+  <w:num w:numId="18">
     <w:abstractNumId w:val="19"/>
   </w:num>
-  <w:num w:numId="19" w16cid:durableId="1403596512">
+  <w:num w:numId="19">
     <w:abstractNumId w:val="0"/>
   </w:num>
-  <w:num w:numId="20" w16cid:durableId="797184916">
+  <w:num w:numId="20">
     <w:abstractNumId w:val="5"/>
   </w:num>
-  <w:num w:numId="21" w16cid:durableId="1923565580">
+  <w:num w:numId="21">
     <w:abstractNumId w:val="24"/>
   </w:num>
-  <w:num w:numId="22" w16cid:durableId="304480441">
+  <w:num w:numId="22">
     <w:abstractNumId w:val="17"/>
   </w:num>
-  <w:num w:numId="23" w16cid:durableId="717583809">
+  <w:num w:numId="23">
     <w:abstractNumId w:val="11"/>
   </w:num>
-  <w:num w:numId="24" w16cid:durableId="961962573">
+  <w:num w:numId="24">
     <w:abstractNumId w:val="1"/>
   </w:num>
-  <w:num w:numId="25" w16cid:durableId="1672635258">
+  <w:num w:numId="25">
     <w:abstractNumId w:val="15"/>
   </w:num>
 </w:numbering>
 </file>
 
 <file path=word/styles.xml><?xml version="1.0" encoding="utf-8"?>
-<w:styles xmlns:mc="http://schemas.openxmlformats.org/markup-compatibility/2006" xmlns:r="http://schemas.openxmlformats.org/officeDocument/2006/relationships" xmlns:w="http://schemas.openxmlformats.org/wordprocessingml/2006/main" xmlns:w14="http://schemas.microsoft.com/office/word/2010/wordml" xmlns:w15="http://schemas.microsoft.com/office/word/2012/wordml" xmlns:w16cex="http://schemas.microsoft.com/office/word/2018/wordml/cex" xmlns:w16cid="http://schemas.microsoft.com/office/word/2016/wordml/cid" xmlns:w16="http://schemas.microsoft.com/office/word/2018/wordml" xmlns:w16du="http://schemas.microsoft.com/office/word/2023/wordml/word16du" xmlns:w16sdtdh="http://schemas.microsoft.com/office/word/2020/wordml/sdtdatahash" xmlns:w16sdtfl="http://schemas.microsoft.com/office/word/2024/wordml/sdtformatlock" xmlns:w16se="http://schemas.microsoft.com/office/word/2015/wordml/symex" mc:Ignorable="w14 w15 w16se w16cid w16 w16cex w16sdtdh w16sdtfl w16du">
+<w:styles xmlns:mc="http://schemas.openxmlformats.org/markup-compatibility/2006" xmlns:r="http://schemas.openxmlformats.org/officeDocument/2006/relationships" xmlns:w="http://schemas.openxmlformats.org/wordprocessingml/2006/main" xmlns:w14="http://schemas.microsoft.com/office/word/2010/wordml" xmlns:w15="http://schemas.microsoft.com/office/word/2012/wordml" xmlns:w16cid="http://schemas.microsoft.com/office/word/2016/wordml/cid" xmlns:w16se="http://schemas.microsoft.com/office/word/2015/wordml/symex" mc:Ignorable="w14 w15 w16se w16cid">
   <w:docDefaults>
     <w:rPrDefault>
       <w:rPr>
@@ -4877,7 +4244,7 @@
       </w:pPr>
     </w:pPrDefault>
   </w:docDefaults>
-  <w:latentStyles w:defLockedState="0" w:defUIPriority="99" w:defSemiHidden="0" w:defUnhideWhenUsed="0" w:defQFormat="0" w:count="376">
+  <w:latentStyles w:defLockedState="0" w:defUIPriority="99" w:defSemiHidden="0" w:defUnhideWhenUsed="0" w:defQFormat="0" w:count="375">
     <w:lsdException w:name="Normal" w:uiPriority="0" w:qFormat="1"/>
     <w:lsdException w:name="heading 1" w:uiPriority="9" w:qFormat="1"/>
     <w:lsdException w:name="heading 2" w:semiHidden="1" w:uiPriority="9" w:unhideWhenUsed="1" w:qFormat="1"/>
@@ -5253,7 +4620,6 @@
     <w:lsdException w:name="Smart Hyperlink" w:semiHidden="1" w:unhideWhenUsed="1"/>
     <w:lsdException w:name="Hashtag" w:semiHidden="1" w:unhideWhenUsed="1"/>
     <w:lsdException w:name="Unresolved Mention" w:semiHidden="1" w:unhideWhenUsed="1"/>
-    <w:lsdException w:name="Smart Link" w:semiHidden="1" w:unhideWhenUsed="1"/>
   </w:latentStyles>
   <w:style w:type="paragraph" w:default="1" w:styleId="Normal">
     <w:name w:val="Normal"/>
@@ -5461,6 +4827,7 @@
   <w:style w:type="character" w:default="1" w:styleId="DefaultParagraphFont">
     <w:name w:val="Default Paragraph Font"/>
     <w:uiPriority w:val="1"/>
+    <w:semiHidden/>
     <w:unhideWhenUsed/>
   </w:style>
   <w:style w:type="table" w:default="1" w:styleId="TableNormal">

</xml_diff>